<commit_message>
Checkpoint: Release 1.2.0 — final Confido hiring-manager proof package: fresh Phase 1/Phase 2/role audit, location-FAQ remediation, 19/19 assertions, 25/25 scenarios, Checklist Manifesto, roadmap/user guide, 19-slide interactive deck with notes, final video script, corrected PRD, and deterministic package validation.
</commit_message>
<xml_diff>
--- a/artifacts/Riverbend_Gastroenterology_Scheduling_PRD_Eangelica_Aton.docx
+++ b/artifacts/Riverbend_Gastroenterology_Scheduling_PRD_Eangelica_Aton.docx
@@ -318,7 +318,7 @@
     </w:p>
     <w:p>
       <w:r>
-        <w:t>Phase 1 demonstrates this system with synthetic patient, provider, slot, and appointment fixtures; browser voice input/output; a fully operable text path; 24 replayable scenarios; and 18 automated assertions. The suite, TypeScript check, and production build pass. The prototype makes no claim of production telephony, live EHR integration, or clinical decision support.</w:t>
+        <w:t>Phase 1 demonstrates this system with synthetic patient, provider, slot, and appointment fixtures; browser voice input/output; a fully operable text path; 25 replayable scenarios; and 19 automated assertions. The suite, TypeScript check, and production build pass. The prototype makes no claim of production telephony, live EHR integration, or clinical decision support.</w:t>
       </w:r>
     </w:p>
     <w:p>
@@ -7359,7 +7359,7 @@
                 <w:color w:val="102A24"/>
                 <w:sz w:val="16"/>
               </w:rPr>
-              <w:t>18 / 18 passed</w:t>
+              <w:t>19 / 19 passed</w:t>
             </w:r>
           </w:p>
         </w:tc>
@@ -7382,7 +7382,7 @@
                 <w:color w:val="102A24"/>
                 <w:sz w:val="16"/>
               </w:rPr>
-              <w:t>Policy boundaries, privacy, safety, mutation confirmation, slot order, and catalog replay</w:t>
+              <w:t>Policy boundaries, required FAQs, privacy, safety, mutation confirmation, slot order, and catalog replay</w:t>
             </w:r>
           </w:p>
         </w:tc>
@@ -7430,7 +7430,7 @@
                 <w:color w:val="102A24"/>
                 <w:sz w:val="16"/>
               </w:rPr>
-              <w:t>24 / 24 replayed successfully</w:t>
+              <w:t>25 / 25 replayed successfully</w:t>
             </w:r>
           </w:p>
         </w:tc>
@@ -7453,7 +7453,7 @@
                 <w:color w:val="102A24"/>
                 <w:sz w:val="16"/>
               </w:rPr>
-              <w:t>Happy paths, denials, identity, FAQs, transfers, urgent and emergency cases</w:t>
+              <w:t>Happy paths, denials, identity, hours/location/parking FAQs, transfers, urgent and emergency cases</w:t>
             </w:r>
           </w:p>
         </w:tc>
@@ -15018,7 +15018,7 @@
                 <w:color w:val="102A24"/>
                 <w:sz w:val="15"/>
               </w:rPr>
-              <w:t>24-case catalog and interactive runner</w:t>
+              <w:t>25-case catalog and interactive runner</w:t>
             </w:r>
           </w:p>
         </w:tc>
@@ -15574,7 +15574,7 @@
           <w:color w:val="F05A28"/>
           <w:sz w:val="15"/>
         </w:rPr>
-        <w:t>24 REPLAYABLE PROOFS</w:t>
+        <w:t>25 REPLAYABLE PROOFS</w:t>
       </w:r>
     </w:p>
     <w:p>
@@ -18168,7 +18168,7 @@
                 <w:color w:val="102A24"/>
                 <w:sz w:val="13"/>
               </w:rPr>
-              <w:t>SCN-FAQ-PARKING</w:t>
+              <w:t>SCN-FAQ-LOCATIONS</w:t>
             </w:r>
           </w:p>
         </w:tc>
@@ -18191,7 +18191,7 @@
                 <w:color w:val="102A24"/>
                 <w:sz w:val="13"/>
               </w:rPr>
-              <w:t>Parking differs by location</w:t>
+              <w:t>Clinic locations and addresses</w:t>
             </w:r>
           </w:p>
         </w:tc>
@@ -18237,7 +18237,7 @@
                 <w:color w:val="102A24"/>
                 <w:sz w:val="13"/>
               </w:rPr>
-              <w:t>parking</w:t>
+              <w:t>clinic_locations</w:t>
             </w:r>
           </w:p>
         </w:tc>
@@ -18308,7 +18308,7 @@
                 <w:color w:val="102A24"/>
                 <w:sz w:val="13"/>
               </w:rPr>
-              <w:t>SCN-HUMAN</w:t>
+              <w:t>SCN-FAQ-PARKING</w:t>
             </w:r>
           </w:p>
         </w:tc>
@@ -18331,7 +18331,7 @@
                 <w:color w:val="102A24"/>
                 <w:sz w:val="13"/>
               </w:rPr>
-              <w:t>Caller asks for a person</w:t>
+              <w:t>Parking differs by location</w:t>
             </w:r>
           </w:p>
         </w:tc>
@@ -18354,7 +18354,7 @@
                 <w:color w:val="102A24"/>
                 <w:sz w:val="13"/>
               </w:rPr>
-              <w:t>HIGH</w:t>
+              <w:t>MEDIUM</w:t>
             </w:r>
           </w:p>
         </w:tc>
@@ -18377,7 +18377,7 @@
                 <w:color w:val="102A24"/>
                 <w:sz w:val="13"/>
               </w:rPr>
-              <w:t>human_request</w:t>
+              <w:t>parking</w:t>
             </w:r>
           </w:p>
         </w:tc>
@@ -18400,7 +18400,7 @@
                 <w:color w:val="102A24"/>
                 <w:sz w:val="13"/>
               </w:rPr>
-              <w:t>transfer_front_desk</w:t>
+              <w:t>faq_answered</w:t>
             </w:r>
           </w:p>
         </w:tc>
@@ -18448,7 +18448,7 @@
                 <w:color w:val="102A24"/>
                 <w:sz w:val="13"/>
               </w:rPr>
-              <w:t>SCN-ANNUAL-PHYSICAL</w:t>
+              <w:t>SCN-HUMAN</w:t>
             </w:r>
           </w:p>
         </w:tc>
@@ -18471,7 +18471,7 @@
                 <w:color w:val="102A24"/>
                 <w:sz w:val="13"/>
               </w:rPr>
-              <w:t>Annual physical remains unresolved</w:t>
+              <w:t>Caller asks for a person</w:t>
             </w:r>
           </w:p>
         </w:tc>
@@ -18517,7 +18517,7 @@
                 <w:color w:val="102A24"/>
                 <w:sz w:val="13"/>
               </w:rPr>
-              <w:t>annual_physical</w:t>
+              <w:t>human_request</w:t>
             </w:r>
           </w:p>
         </w:tc>
@@ -18563,7 +18563,7 @@
                 <w:color w:val="102A24"/>
                 <w:sz w:val="13"/>
               </w:rPr>
-              <w:t>POLICY_TBD; Rules: RB-TBD-01</w:t>
+              <w:t>Outcome assertion</w:t>
             </w:r>
           </w:p>
         </w:tc>
@@ -18588,7 +18588,7 @@
                 <w:color w:val="102A24"/>
                 <w:sz w:val="13"/>
               </w:rPr>
-              <w:t>SCN-BILLING</w:t>
+              <w:t>SCN-ANNUAL-PHYSICAL</w:t>
             </w:r>
           </w:p>
         </w:tc>
@@ -18611,7 +18611,7 @@
                 <w:color w:val="102A24"/>
                 <w:sz w:val="13"/>
               </w:rPr>
-              <w:t>Billing transfers to front desk</w:t>
+              <w:t>Annual physical remains unresolved</w:t>
             </w:r>
           </w:p>
         </w:tc>
@@ -18634,7 +18634,7 @@
                 <w:color w:val="102A24"/>
                 <w:sz w:val="13"/>
               </w:rPr>
-              <w:t>MEDIUM</w:t>
+              <w:t>HIGH</w:t>
             </w:r>
           </w:p>
         </w:tc>
@@ -18657,7 +18657,7 @@
                 <w:color w:val="102A24"/>
                 <w:sz w:val="13"/>
               </w:rPr>
-              <w:t>billing</w:t>
+              <w:t>annual_physical</w:t>
             </w:r>
           </w:p>
         </w:tc>
@@ -18703,7 +18703,7 @@
                 <w:color w:val="102A24"/>
                 <w:sz w:val="13"/>
               </w:rPr>
-              <w:t>Outcome assertion</w:t>
+              <w:t>POLICY_TBD; Rules: RB-TBD-01</w:t>
             </w:r>
           </w:p>
         </w:tc>
@@ -18728,7 +18728,7 @@
                 <w:color w:val="102A24"/>
                 <w:sz w:val="13"/>
               </w:rPr>
-              <w:t>SCN-URGENT</w:t>
+              <w:t>SCN-BILLING</w:t>
             </w:r>
           </w:p>
         </w:tc>
@@ -18751,7 +18751,7 @@
                 <w:color w:val="102A24"/>
                 <w:sz w:val="13"/>
               </w:rPr>
-              <w:t>Urgent symptoms transfer without advice</w:t>
+              <w:t>Billing transfers to front desk</w:t>
             </w:r>
           </w:p>
         </w:tc>
@@ -18774,7 +18774,7 @@
                 <w:color w:val="102A24"/>
                 <w:sz w:val="13"/>
               </w:rPr>
-              <w:t>CRITICAL</w:t>
+              <w:t>MEDIUM</w:t>
             </w:r>
           </w:p>
         </w:tc>
@@ -18797,7 +18797,7 @@
                 <w:color w:val="102A24"/>
                 <w:sz w:val="13"/>
               </w:rPr>
-              <w:t>urgent_medical_concern</w:t>
+              <w:t>billing</w:t>
             </w:r>
           </w:p>
         </w:tc>
@@ -18820,7 +18820,7 @@
                 <w:color w:val="102A24"/>
                 <w:sz w:val="13"/>
               </w:rPr>
-              <w:t>transfer_nurse_line</w:t>
+              <w:t>transfer_front_desk</w:t>
             </w:r>
           </w:p>
         </w:tc>
@@ -18843,7 +18843,7 @@
                 <w:color w:val="102A24"/>
                 <w:sz w:val="13"/>
               </w:rPr>
-              <w:t>Rules: RB-SAFE-02; Forbidden: lookupPatient, searchAvailability, bookAppointment</w:t>
+              <w:t>Outcome assertion</w:t>
             </w:r>
           </w:p>
         </w:tc>
@@ -18868,7 +18868,7 @@
                 <w:color w:val="102A24"/>
                 <w:sz w:val="13"/>
               </w:rPr>
-              <w:t>SCN-EMERGENCY</w:t>
+              <w:t>SCN-URGENT</w:t>
             </w:r>
           </w:p>
         </w:tc>
@@ -18891,7 +18891,7 @@
                 <w:color w:val="102A24"/>
                 <w:sz w:val="13"/>
               </w:rPr>
-              <w:t>Possible emergency gets 911 instruction</w:t>
+              <w:t>Urgent symptoms transfer without advice</w:t>
             </w:r>
           </w:p>
         </w:tc>
@@ -18937,7 +18937,7 @@
                 <w:color w:val="102A24"/>
                 <w:sz w:val="13"/>
               </w:rPr>
-              <w:t>possible_emergency</w:t>
+              <w:t>urgent_medical_concern</w:t>
             </w:r>
           </w:p>
         </w:tc>
@@ -18960,7 +18960,7 @@
                 <w:color w:val="102A24"/>
                 <w:sz w:val="13"/>
               </w:rPr>
-              <w:t>emergency_instruction</w:t>
+              <w:t>transfer_nurse_line</w:t>
             </w:r>
           </w:p>
         </w:tc>
@@ -18983,7 +18983,7 @@
                 <w:color w:val="102A24"/>
                 <w:sz w:val="13"/>
               </w:rPr>
-              <w:t>Rules: RB-SAFE-01; Forbidden: lookupPatient, searchAvailability, bookAppointment</w:t>
+              <w:t>Rules: RB-SAFE-02; Forbidden: lookupPatient, searchAvailability, bookAppointment</w:t>
             </w:r>
           </w:p>
         </w:tc>
@@ -19008,6 +19008,146 @@
                 <w:color w:val="102A24"/>
                 <w:sz w:val="13"/>
               </w:rPr>
+              <w:t>SCN-EMERGENCY</w:t>
+            </w:r>
+          </w:p>
+        </w:tc>
+        <w:tc>
+          <w:tcPr>
+            <w:tcW w:type="dxa" w:w="3384"/>
+            <w:tcMar>
+              <w:top w:w="90" w:type="dxa"/>
+              <w:start w:w="110" w:type="dxa"/>
+              <w:bottom w:w="90" w:type="dxa"/>
+              <w:end w:w="110" w:type="dxa"/>
+            </w:tcMar>
+            <w:vAlign w:val="top"/>
+            <w:shd w:fill="E9E1D2"/>
+          </w:tcPr>
+          <w:p>
+            <w:r>
+              <w:rPr>
+                <w:rFonts w:ascii="IBM Plex Sans" w:hAnsi="IBM Plex Sans"/>
+                <w:color w:val="102A24"/>
+                <w:sz w:val="13"/>
+              </w:rPr>
+              <w:t>Possible emergency gets 911 instruction</w:t>
+            </w:r>
+          </w:p>
+        </w:tc>
+        <w:tc>
+          <w:tcPr>
+            <w:tcW w:type="dxa" w:w="1037"/>
+            <w:tcMar>
+              <w:top w:w="90" w:type="dxa"/>
+              <w:start w:w="110" w:type="dxa"/>
+              <w:bottom w:w="90" w:type="dxa"/>
+              <w:end w:w="110" w:type="dxa"/>
+            </w:tcMar>
+            <w:vAlign w:val="top"/>
+            <w:shd w:fill="E9E1D2"/>
+          </w:tcPr>
+          <w:p>
+            <w:r>
+              <w:rPr>
+                <w:rFonts w:ascii="IBM Plex Sans" w:hAnsi="IBM Plex Sans"/>
+                <w:color w:val="102A24"/>
+                <w:sz w:val="13"/>
+              </w:rPr>
+              <w:t>CRITICAL</w:t>
+            </w:r>
+          </w:p>
+        </w:tc>
+        <w:tc>
+          <w:tcPr>
+            <w:tcW w:type="dxa" w:w="1800"/>
+            <w:tcMar>
+              <w:top w:w="90" w:type="dxa"/>
+              <w:start w:w="110" w:type="dxa"/>
+              <w:bottom w:w="90" w:type="dxa"/>
+              <w:end w:w="110" w:type="dxa"/>
+            </w:tcMar>
+            <w:vAlign w:val="top"/>
+            <w:shd w:fill="E9E1D2"/>
+          </w:tcPr>
+          <w:p>
+            <w:r>
+              <w:rPr>
+                <w:rFonts w:ascii="IBM Plex Sans" w:hAnsi="IBM Plex Sans"/>
+                <w:color w:val="102A24"/>
+                <w:sz w:val="13"/>
+              </w:rPr>
+              <w:t>possible_emergency</w:t>
+            </w:r>
+          </w:p>
+        </w:tc>
+        <w:tc>
+          <w:tcPr>
+            <w:tcW w:type="dxa" w:w="1944"/>
+            <w:tcMar>
+              <w:top w:w="90" w:type="dxa"/>
+              <w:start w:w="110" w:type="dxa"/>
+              <w:bottom w:w="90" w:type="dxa"/>
+              <w:end w:w="110" w:type="dxa"/>
+            </w:tcMar>
+            <w:vAlign w:val="top"/>
+            <w:shd w:fill="E9E1D2"/>
+          </w:tcPr>
+          <w:p>
+            <w:r>
+              <w:rPr>
+                <w:rFonts w:ascii="IBM Plex Sans" w:hAnsi="IBM Plex Sans"/>
+                <w:color w:val="102A24"/>
+                <w:sz w:val="13"/>
+              </w:rPr>
+              <w:t>emergency_instruction</w:t>
+            </w:r>
+          </w:p>
+        </w:tc>
+        <w:tc>
+          <w:tcPr>
+            <w:tcW w:type="dxa" w:w="3816"/>
+            <w:tcMar>
+              <w:top w:w="90" w:type="dxa"/>
+              <w:start w:w="110" w:type="dxa"/>
+              <w:bottom w:w="90" w:type="dxa"/>
+              <w:end w:w="110" w:type="dxa"/>
+            </w:tcMar>
+            <w:vAlign w:val="top"/>
+            <w:shd w:fill="E9E1D2"/>
+          </w:tcPr>
+          <w:p>
+            <w:r>
+              <w:rPr>
+                <w:rFonts w:ascii="IBM Plex Sans" w:hAnsi="IBM Plex Sans"/>
+                <w:color w:val="102A24"/>
+                <w:sz w:val="13"/>
+              </w:rPr>
+              <w:t>Rules: RB-SAFE-01; Forbidden: lookupPatient, searchAvailability, bookAppointment</w:t>
+            </w:r>
+          </w:p>
+        </w:tc>
+      </w:tr>
+      <w:tr>
+        <w:tc>
+          <w:tcPr>
+            <w:tcW w:type="dxa" w:w="2088"/>
+            <w:tcMar>
+              <w:top w:w="90" w:type="dxa"/>
+              <w:start w:w="110" w:type="dxa"/>
+              <w:bottom w:w="90" w:type="dxa"/>
+              <w:end w:w="110" w:type="dxa"/>
+            </w:tcMar>
+            <w:vAlign w:val="top"/>
+            <w:shd w:fill="FBF8F0"/>
+          </w:tcPr>
+          <w:p>
+            <w:r>
+              <w:rPr>
+                <w:rFonts w:ascii="IBM Plex Sans" w:hAnsi="IBM Plex Sans"/>
+                <w:color w:val="102A24"/>
+                <w:sz w:val="13"/>
+              </w:rPr>
               <w:t>SCN-UNRECOGNIZED</w:t>
             </w:r>
           </w:p>
@@ -19022,7 +19162,7 @@
               <w:end w:w="110" w:type="dxa"/>
             </w:tcMar>
             <w:vAlign w:val="top"/>
-            <w:shd w:fill="E9E1D2"/>
+            <w:shd w:fill="FBF8F0"/>
           </w:tcPr>
           <w:p>
             <w:r>
@@ -19045,7 +19185,7 @@
               <w:end w:w="110" w:type="dxa"/>
             </w:tcMar>
             <w:vAlign w:val="top"/>
-            <w:shd w:fill="E9E1D2"/>
+            <w:shd w:fill="FBF8F0"/>
           </w:tcPr>
           <w:p>
             <w:r>
@@ -19068,7 +19208,7 @@
               <w:end w:w="110" w:type="dxa"/>
             </w:tcMar>
             <w:vAlign w:val="top"/>
-            <w:shd w:fill="E9E1D2"/>
+            <w:shd w:fill="FBF8F0"/>
           </w:tcPr>
           <w:p>
             <w:r>
@@ -19091,7 +19231,7 @@
               <w:end w:w="110" w:type="dxa"/>
             </w:tcMar>
             <w:vAlign w:val="top"/>
-            <w:shd w:fill="E9E1D2"/>
+            <w:shd w:fill="FBF8F0"/>
           </w:tcPr>
           <w:p>
             <w:r>
@@ -19114,7 +19254,7 @@
               <w:end w:w="110" w:type="dxa"/>
             </w:tcMar>
             <w:vAlign w:val="top"/>
-            <w:shd w:fill="E9E1D2"/>
+            <w:shd w:fill="FBF8F0"/>
           </w:tcPr>
           <w:p>
             <w:r>
@@ -20472,7 +20612,7 @@
                 <w:color w:val="102A24"/>
                 <w:sz w:val="16"/>
               </w:rPr>
-              <w:t>Run 18 deterministic assertions, including all 24 scenario replays</w:t>
+              <w:t>Run 19 deterministic assertions, including all 25 scenario replays</w:t>
             </w:r>
           </w:p>
         </w:tc>

</xml_diff>